<commit_message>
Added problem 2 draw
</commit_message>
<xml_diff>
--- a/DFA-NFA.docx
+++ b/DFA-NFA.docx
@@ -69,7 +69,10 @@
           </w:tcPr>
           <w:p>
             <w:r>
-              <w:t>20210505</w:t>
+              <w:t>202105</w:t>
+            </w:r>
+            <w:r>
+              <w:t>14</w:t>
             </w:r>
           </w:p>
         </w:tc>
@@ -91,7 +94,10 @@
           </w:tcPr>
           <w:p>
             <w:r>
-              <w:t>20210514</w:t>
+              <w:t>202105</w:t>
+            </w:r>
+            <w:r>
+              <w:t>05</w:t>
             </w:r>
           </w:p>
         </w:tc>
@@ -133,13 +139,8 @@
           </w:tcPr>
           <w:p>
             <w:r>
-              <w:t xml:space="preserve">Asmaa </w:t>
+              <w:t>Asmaa Elawady</w:t>
             </w:r>
-            <w:proofErr w:type="spellStart"/>
-            <w:r>
-              <w:t>Elawady</w:t>
-            </w:r>
-            <w:proofErr w:type="spellEnd"/>
           </w:p>
         </w:tc>
       </w:tr>
@@ -219,6 +220,63 @@
                     <a:ln>
                       <a:noFill/>
                     </a:ln>
+                  </pic:spPr>
+                </pic:pic>
+              </a:graphicData>
+            </a:graphic>
+          </wp:inline>
+        </w:drawing>
+      </w:r>
+    </w:p>
+    <w:p>
+      <w:r>
+        <w:t>2-</w:t>
+      </w:r>
+    </w:p>
+    <w:p>
+      <w:r>
+        <w:rPr>
+          <w:noProof/>
+        </w:rPr>
+        <w:drawing>
+          <wp:inline distT="0" distB="0" distL="0" distR="0" wp14:anchorId="5F473377" wp14:editId="791B5E4C">
+            <wp:extent cx="5619750" cy="2305138"/>
+            <wp:effectExtent l="0" t="0" r="0" b="0"/>
+            <wp:docPr id="1172937468" name="Picture 2"/>
+            <wp:cNvGraphicFramePr>
+              <a:graphicFrameLocks xmlns:a="http://schemas.openxmlformats.org/drawingml/2006/main" noChangeAspect="1"/>
+            </wp:cNvGraphicFramePr>
+            <a:graphic xmlns:a="http://schemas.openxmlformats.org/drawingml/2006/main">
+              <a:graphicData uri="http://schemas.openxmlformats.org/drawingml/2006/picture">
+                <pic:pic xmlns:pic="http://schemas.openxmlformats.org/drawingml/2006/picture">
+                  <pic:nvPicPr>
+                    <pic:cNvPr id="0" name="Picture 2"/>
+                    <pic:cNvPicPr>
+                      <a:picLocks noChangeAspect="1" noChangeArrowheads="1"/>
+                    </pic:cNvPicPr>
+                  </pic:nvPicPr>
+                  <pic:blipFill>
+                    <a:blip r:embed="rId5">
+                      <a:extLst>
+                        <a:ext uri="{28A0092B-C50C-407E-A947-70E740481C1C}">
+                          <a14:useLocalDpi xmlns:a14="http://schemas.microsoft.com/office/drawing/2010/main" val="0"/>
+                        </a:ext>
+                      </a:extLst>
+                    </a:blip>
+                    <a:srcRect/>
+                    <a:stretch>
+                      <a:fillRect/>
+                    </a:stretch>
+                  </pic:blipFill>
+                  <pic:spPr bwMode="auto">
+                    <a:xfrm>
+                      <a:off x="0" y="0"/>
+                      <a:ext cx="5640988" cy="2313849"/>
+                    </a:xfrm>
+                    <a:prstGeom prst="rect">
+                      <a:avLst/>
+                    </a:prstGeom>
+                    <a:noFill/>
                   </pic:spPr>
                 </pic:pic>
               </a:graphicData>

</xml_diff>

<commit_message>
added problem 3 DFA
</commit_message>
<xml_diff>
--- a/DFA-NFA.docx
+++ b/DFA-NFA.docx
@@ -139,13 +139,8 @@
           </w:tcPr>
           <w:p>
             <w:r>
-              <w:t xml:space="preserve">Asmaa </w:t>
+              <w:t>Asmaa Elawady</w:t>
             </w:r>
-            <w:proofErr w:type="spellStart"/>
-            <w:r>
-              <w:t>Elawady</w:t>
-            </w:r>
-            <w:proofErr w:type="spellEnd"/>
           </w:p>
         </w:tc>
       </w:tr>
@@ -244,7 +239,7 @@
           <w:noProof/>
         </w:rPr>
         <w:drawing>
-          <wp:inline distT="0" distB="0" distL="0" distR="0" wp14:anchorId="5F473377" wp14:editId="791B5E4C">
+          <wp:inline distT="0" distB="0" distL="0" distR="0" wp14:anchorId="5F473377" wp14:editId="457A9BDC">
             <wp:extent cx="5619750" cy="2305138"/>
             <wp:effectExtent l="0" t="0" r="0" b="0"/>
             <wp:docPr id="1172937468" name="Picture 2"/>
@@ -292,11 +287,79 @@
     </w:p>
     <w:p>
       <w:r>
+        <w:rPr>
+          <w:noProof/>
+        </w:rPr>
+        <w:drawing>
+          <wp:anchor distT="0" distB="0" distL="114300" distR="114300" simplePos="0" relativeHeight="251658240" behindDoc="0" locked="0" layoutInCell="1" allowOverlap="1" wp14:anchorId="49F2EF09" wp14:editId="0AB48F6A">
+            <wp:simplePos x="0" y="0"/>
+            <wp:positionH relativeFrom="margin">
+              <wp:posOffset>47625</wp:posOffset>
+            </wp:positionH>
+            <wp:positionV relativeFrom="bottomMargin">
+              <wp:posOffset>-1800225</wp:posOffset>
+            </wp:positionV>
+            <wp:extent cx="5553075" cy="2171700"/>
+            <wp:effectExtent l="0" t="0" r="9525" b="0"/>
+            <wp:wrapSquare wrapText="bothSides"/>
+            <wp:docPr id="844286603" name="Picture 1" descr="A diagram of a graph&#10;&#10;AI-generated content may be incorrect."/>
+            <wp:cNvGraphicFramePr>
+              <a:graphicFrameLocks xmlns:a="http://schemas.openxmlformats.org/drawingml/2006/main" noChangeAspect="1"/>
+            </wp:cNvGraphicFramePr>
+            <a:graphic xmlns:a="http://schemas.openxmlformats.org/drawingml/2006/main">
+              <a:graphicData uri="http://schemas.openxmlformats.org/drawingml/2006/picture">
+                <pic:pic xmlns:pic="http://schemas.openxmlformats.org/drawingml/2006/picture">
+                  <pic:nvPicPr>
+                    <pic:cNvPr id="844286603" name="Picture 1" descr="A diagram of a graph&#10;&#10;AI-generated content may be incorrect."/>
+                    <pic:cNvPicPr/>
+                  </pic:nvPicPr>
+                  <pic:blipFill rotWithShape="1">
+                    <a:blip r:embed="rId6">
+                      <a:extLst>
+                        <a:ext uri="{28A0092B-C50C-407E-A947-70E740481C1C}">
+                          <a14:useLocalDpi xmlns:a14="http://schemas.microsoft.com/office/drawing/2010/main" val="0"/>
+                        </a:ext>
+                      </a:extLst>
+                    </a:blip>
+                    <a:srcRect t="15225" b="12290"/>
+                    <a:stretch/>
+                  </pic:blipFill>
+                  <pic:spPr bwMode="auto">
+                    <a:xfrm>
+                      <a:off x="0" y="0"/>
+                      <a:ext cx="5553075" cy="2171700"/>
+                    </a:xfrm>
+                    <a:prstGeom prst="rect">
+                      <a:avLst/>
+                    </a:prstGeom>
+                    <a:ln>
+                      <a:noFill/>
+                    </a:ln>
+                    <a:extLst>
+                      <a:ext uri="{53640926-AAD7-44D8-BBD7-CCE9431645EC}">
+                        <a14:shadowObscured xmlns:a14="http://schemas.microsoft.com/office/drawing/2010/main"/>
+                      </a:ext>
+                    </a:extLst>
+                  </pic:spPr>
+                </pic:pic>
+              </a:graphicData>
+            </a:graphic>
+            <wp14:sizeRelH relativeFrom="margin">
+              <wp14:pctWidth>0</wp14:pctWidth>
+            </wp14:sizeRelH>
+            <wp14:sizeRelV relativeFrom="margin">
+              <wp14:pctHeight>0</wp14:pctHeight>
+            </wp14:sizeRelV>
+          </wp:anchor>
+        </w:drawing>
+      </w:r>
+      <w:r>
         <w:t>3-</w:t>
       </w:r>
     </w:p>
     <w:p>
       <w:r>
+        <w:lastRenderedPageBreak/>
         <w:t>4-</w:t>
       </w:r>
     </w:p>
@@ -307,7 +370,6 @@
     <w:p/>
     <w:p>
       <w:r>
-        <w:lastRenderedPageBreak/>
         <w:t>5-</w:t>
       </w:r>
     </w:p>
@@ -334,7 +396,7 @@
                     </pic:cNvPicPr>
                   </pic:nvPicPr>
                   <pic:blipFill>
-                    <a:blip r:embed="rId6">
+                    <a:blip r:embed="rId7">
                       <a:extLst>
                         <a:ext uri="{28A0092B-C50C-407E-A947-70E740481C1C}">
                           <a14:useLocalDpi xmlns:a14="http://schemas.microsoft.com/office/drawing/2010/main" val="0"/>

</xml_diff>

<commit_message>
Added Design for Problem 6 and 10
</commit_message>
<xml_diff>
--- a/DFA-NFA.docx
+++ b/DFA-NFA.docx
@@ -139,13 +139,8 @@
           </w:tcPr>
           <w:p>
             <w:r>
-              <w:t xml:space="preserve">Asmaa </w:t>
+              <w:t>Asmaa Elawady</w:t>
             </w:r>
-            <w:proofErr w:type="spellStart"/>
-            <w:r>
-              <w:t>Elawady</w:t>
-            </w:r>
-            <w:proofErr w:type="spellEnd"/>
           </w:p>
         </w:tc>
       </w:tr>
@@ -419,6 +414,136 @@
                       <a:avLst/>
                     </a:prstGeom>
                     <a:noFill/>
+                  </pic:spPr>
+                </pic:pic>
+              </a:graphicData>
+            </a:graphic>
+          </wp:inline>
+        </w:drawing>
+      </w:r>
+    </w:p>
+    <w:p>
+      <w:r>
+        <w:t>6-</w:t>
+      </w:r>
+    </w:p>
+    <w:p>
+      <w:r>
+        <w:drawing>
+          <wp:inline distT="0" distB="0" distL="0" distR="0" wp14:anchorId="13B73889" wp14:editId="60387038">
+            <wp:extent cx="3764280" cy="2545080"/>
+            <wp:effectExtent l="0" t="0" r="7620" b="7620"/>
+            <wp:docPr id="1323516349" name="Picture 2" descr="A diagram of a diagram&#10;&#10;AI-generated content may be incorrect."/>
+            <wp:cNvGraphicFramePr>
+              <a:graphicFrameLocks xmlns:a="http://schemas.openxmlformats.org/drawingml/2006/main" noChangeAspect="1"/>
+            </wp:cNvGraphicFramePr>
+            <a:graphic xmlns:a="http://schemas.openxmlformats.org/drawingml/2006/main">
+              <a:graphicData uri="http://schemas.openxmlformats.org/drawingml/2006/picture">
+                <pic:pic xmlns:pic="http://schemas.openxmlformats.org/drawingml/2006/picture">
+                  <pic:nvPicPr>
+                    <pic:cNvPr id="1323516349" name="Picture 2" descr="A diagram of a diagram&#10;&#10;AI-generated content may be incorrect."/>
+                    <pic:cNvPicPr>
+                      <a:picLocks noChangeAspect="1" noChangeArrowheads="1"/>
+                    </pic:cNvPicPr>
+                  </pic:nvPicPr>
+                  <pic:blipFill>
+                    <a:blip r:embed="rId8">
+                      <a:extLst>
+                        <a:ext uri="{28A0092B-C50C-407E-A947-70E740481C1C}">
+                          <a14:useLocalDpi xmlns:a14="http://schemas.microsoft.com/office/drawing/2010/main" val="0"/>
+                        </a:ext>
+                      </a:extLst>
+                    </a:blip>
+                    <a:srcRect/>
+                    <a:stretch>
+                      <a:fillRect/>
+                    </a:stretch>
+                  </pic:blipFill>
+                  <pic:spPr bwMode="auto">
+                    <a:xfrm>
+                      <a:off x="0" y="0"/>
+                      <a:ext cx="3764280" cy="2545080"/>
+                    </a:xfrm>
+                    <a:prstGeom prst="rect">
+                      <a:avLst/>
+                    </a:prstGeom>
+                    <a:noFill/>
+                    <a:ln>
+                      <a:noFill/>
+                    </a:ln>
+                  </pic:spPr>
+                </pic:pic>
+              </a:graphicData>
+            </a:graphic>
+          </wp:inline>
+        </w:drawing>
+      </w:r>
+    </w:p>
+    <w:p>
+      <w:r>
+        <w:t>7-</w:t>
+      </w:r>
+    </w:p>
+    <w:p>
+      <w:r>
+        <w:t>8-</w:t>
+      </w:r>
+    </w:p>
+    <w:p>
+      <w:r>
+        <w:lastRenderedPageBreak/>
+        <w:t>9-</w:t>
+      </w:r>
+    </w:p>
+    <w:p>
+      <w:r>
+        <w:t>10-</w:t>
+      </w:r>
+    </w:p>
+    <w:p>
+      <w:r>
+        <w:drawing>
+          <wp:inline distT="0" distB="0" distL="0" distR="0" wp14:anchorId="4F33428D" wp14:editId="2CFA9C12">
+            <wp:extent cx="5288280" cy="1752600"/>
+            <wp:effectExtent l="0" t="0" r="7620" b="0"/>
+            <wp:docPr id="19575815" name="Picture 4" descr="A diagram of a circle with arrows&#10;&#10;AI-generated content may be incorrect."/>
+            <wp:cNvGraphicFramePr>
+              <a:graphicFrameLocks xmlns:a="http://schemas.openxmlformats.org/drawingml/2006/main" noChangeAspect="1"/>
+            </wp:cNvGraphicFramePr>
+            <a:graphic xmlns:a="http://schemas.openxmlformats.org/drawingml/2006/main">
+              <a:graphicData uri="http://schemas.openxmlformats.org/drawingml/2006/picture">
+                <pic:pic xmlns:pic="http://schemas.openxmlformats.org/drawingml/2006/picture">
+                  <pic:nvPicPr>
+                    <pic:cNvPr id="19575815" name="Picture 4" descr="A diagram of a circle with arrows&#10;&#10;AI-generated content may be incorrect."/>
+                    <pic:cNvPicPr>
+                      <a:picLocks noChangeAspect="1" noChangeArrowheads="1"/>
+                    </pic:cNvPicPr>
+                  </pic:nvPicPr>
+                  <pic:blipFill>
+                    <a:blip r:embed="rId9">
+                      <a:extLst>
+                        <a:ext uri="{28A0092B-C50C-407E-A947-70E740481C1C}">
+                          <a14:useLocalDpi xmlns:a14="http://schemas.microsoft.com/office/drawing/2010/main" val="0"/>
+                        </a:ext>
+                      </a:extLst>
+                    </a:blip>
+                    <a:srcRect/>
+                    <a:stretch>
+                      <a:fillRect/>
+                    </a:stretch>
+                  </pic:blipFill>
+                  <pic:spPr bwMode="auto">
+                    <a:xfrm>
+                      <a:off x="0" y="0"/>
+                      <a:ext cx="5288280" cy="1752600"/>
+                    </a:xfrm>
+                    <a:prstGeom prst="rect">
+                      <a:avLst/>
+                    </a:prstGeom>
+                    <a:noFill/>
+                    <a:ln>
+                      <a:noFill/>
+                    </a:ln>
                   </pic:spPr>
                 </pic:pic>
               </a:graphicData>
@@ -1040,7 +1165,6 @@
   <w:style w:type="character" w:default="1" w:styleId="DefaultParagraphFont">
     <w:name w:val="Default Paragraph Font"/>
     <w:uiPriority w:val="1"/>
-    <w:semiHidden/>
     <w:unhideWhenUsed/>
   </w:style>
   <w:style w:type="table" w:default="1" w:styleId="TableNormal">

</xml_diff>